<commit_message>
Data - 5/22/2026 part 2
</commit_message>
<xml_diff>
--- a/Data/Private Data/Data Collections 5-22-2026.docx
+++ b/Data/Private Data/Data Collections 5-22-2026.docx
@@ -17,12 +17,12 @@
     </w:p>
     <w:p>
       <w:r>
-        <w:t>Total Rows: 5651</w:t>
+        <w:t>Total Rows: 5665</w:t>
       </w:r>
     </w:p>
     <w:p>
       <w:r>
-        <w:t>Total Columns: 1621</w:t>
+        <w:t>Total Columns: 1615</w:t>
       </w:r>
     </w:p>
     <w:p>
@@ -1279,7 +1279,7 @@
           <w:b w:val="0"/>
           <w:sz w:val="18"/>
         </w:rPr>
-        <w:t>294 x 31</w:t>
+        <w:t>300 x 31</w:t>
       </w:r>
       <w:r>
         <w:rPr>
@@ -4367,7 +4367,7 @@
           <w:b w:val="0"/>
           <w:sz w:val="16"/>
         </w:rPr>
-        <w:t>1 x 21</w:t>
+        <w:t>1 x 19</w:t>
       </w:r>
       <w:r>
         <w:rPr>
@@ -4418,7 +4418,7 @@
           <w:b w:val="0"/>
           <w:sz w:val="16"/>
         </w:rPr>
-        <w:t>2 x 17</w:t>
+        <w:t>3 x 15</w:t>
       </w:r>
       <w:r>
         <w:rPr>
@@ -4469,7 +4469,7 @@
           <w:b w:val="0"/>
           <w:sz w:val="16"/>
         </w:rPr>
-        <w:t>14 x 18</w:t>
+        <w:t>21 x 16</w:t>
       </w:r>
       <w:r>
         <w:rPr>

</xml_diff>